<commit_message>
Kick-off pack §5: write-back gate chain matches the roadmap (adds build_decision_sheet.py + export_kickoff_docx.py)
Co-authored-by: arena-agent <297053741+arena-agent@users.noreply.github.com>
</commit_message>
<xml_diff>
--- a/elearning-course/scorm-plans/00_program/kickoff-pack.docx
+++ b/elearning-course/scorm-plans/00_program/kickoff-pack.docx
@@ -1460,12 +1460,17 @@
     </w:p>
     <w:p>
       <w:r>
-        <w:t>→ build_scorm_structure.py → export_storyboard_docx.py → audit_assets.py, and regenerates</w:t>
+        <w:t>→ build_scorm_structure.py → export_storyboard_docx.py → build_decision_sheet.py (the closed</w:t>
       </w:r>
     </w:p>
     <w:p>
       <w:r>
-        <w:t>decision-sheet.md so the row disappears from the open list.</w:t>
+        <w:t>row disappears from the open list) → export_kickoff_docx.py → audit_assets.py, which must exit</w:t>
+      </w:r>
+    </w:p>
+    <w:p>
+      <w:r>
+        <w:t>clean.</w:t>
       </w:r>
     </w:p>
     <w:p>

</xml_diff>

<commit_message>
Kick-off pack v0.2: draft packages, Oracle sample, D9 recommendation
Regenerated decision sheet (102 open rows, D9 now recommends Oracle Learning +
SCORM 1.2) and kickoff-pack.docx; pre-reads add the project map and the Oracle
Learning sample with its test guide.

Co-Authored-By: Claude Opus 5.5 <noreply@anthropic.com>
Claude-Session: https://claude.ai/code/session_01LeBMPuPXg3NJXsy2o9GP25
</commit_message>
<xml_diff>
--- a/elearning-course/scorm-plans/00_program/kickoff-pack.docx
+++ b/elearning-course/scorm-plans/00_program/kickoff-pack.docx
@@ -298,7 +298,7 @@
           <w:i/>
           <w:color w:val="5B6B7B"/>
         </w:rPr>
-        <w:t>Document MC-KO-01 · v0.1 · 2026-10-14. Working pack for the Phase 0 kick-off meeting</w:t>
+        <w:t>Document MC-KO-01 · v0.2 · 2026-10-19 (v0.1 2026-10-14). Working pack for the Phase 0 kick-off meeting</w:t>
       </w:r>
     </w:p>
     <w:p>
@@ -407,7 +407,32 @@
     </w:p>
     <w:p>
       <w:r>
-        <w:t>captures. Build cannot start until the tier-1 and tier-3 rows are closed.</w:t>
+        <w:t>captures. Release builds cannot start until the tier-1 and tier-3 rows are closed.</w:t>
+      </w:r>
+    </w:p>
+    <w:p>
+      <w:r>
+        <w:t>New since v0.1 (2026-10-19): all eight packages exist as compiled, validated v0.1-draft SCORM</w:t>
+      </w:r>
+    </w:p>
+    <w:p>
+      <w:r>
+        <w:t>packages (open facts shown as ⚠ Draft — pending); the full-size Noor and Dr. Omar artwork is in;</w:t>
+      </w:r>
+    </w:p>
+    <w:p>
+      <w:r>
+        <w:t>every screen carries the My Clinic brand weave. Because My Clinic runs Oracle Applications Cloud, the</w:t>
+      </w:r>
+    </w:p>
+    <w:p>
+      <w:r>
+        <w:t>packages are now SCORM 1.2 for Oracle Learning, and an 8-minute Oracle Learning sample package</w:t>
+      </w:r>
+    </w:p>
+    <w:p>
+      <w:r>
+        <w:t>with a test guide is ready for the LMS team — bring the result of that test to close D9.</w:t>
       </w:r>
     </w:p>
     <w:p>
@@ -756,7 +781,7 @@
                 <w:rFonts w:ascii="Montserrat" w:hAnsi="Montserrat"/>
                 <w:sz w:val="15"/>
               </w:rPr>
-              <w:t>Tier 3 enablers: D9 LMS + SCORM version, D10 voice route (hear the two companion voice briefs), D11 brand confirmation</w:t>
+              <w:t>Tier 3 enablers: D9 LMS + SCORM version (Oracle Learning, SCORM 1.2 — sample test result), D10 voice route (hear the two companion voice briefs), D11 brand confirmation</w:t>
             </w:r>
           </w:p>
         </w:tc>
@@ -1405,7 +1430,7 @@
         <w:pStyle w:val="ListNumber"/>
       </w:pPr>
       <w:r>
-        <w:t>Asset &amp; template audit — what exists, what is still to be supplied (companion PNGs, consented photos, test captures).</w:t>
+        <w:t>Asset &amp; template audit — what exists, what is still to be supplied (consented photos, test captures; companion art is done).</w:t>
       </w:r>
     </w:p>
     <w:p>
@@ -1413,7 +1438,15 @@
         <w:pStyle w:val="ListNumber"/>
       </w:pPr>
       <w:r>
-        <w:t>Programme status and the production board.</w:t>
+        <w:t>Programme status, the project map and the production board.</w:t>
+      </w:r>
+    </w:p>
+    <w:p>
+      <w:pPr>
+        <w:pStyle w:val="ListNumber"/>
+      </w:pPr>
+      <w:r>
+        <w:t>Oracle Learning sample package + test guide — for the LMS administrator before the D9 item.</w:t>
       </w:r>
     </w:p>
     <w:p>
@@ -6374,7 +6407,7 @@
                 <w:rFonts w:ascii="Montserrat" w:hAnsi="Montserrat"/>
                 <w:sz w:val="15"/>
               </w:rPr>
-              <w:t>Which LMS (Moodle, Cornerstone, TalentLMS, …)? Does it run SCORM 2004 4th edition?</w:t>
+              <w:t>My Clinic uses Oracle Applications Cloud (HR source: Oracle self-service), so the LMS is expected to be Oracle Learning. Recommended: SCORM 1.2 for all eight packages (Oracle documents 1.2 and 2004 Ed. 2–3; compiler emits 2004 4th Ed.). Confirm with the sample package test (00_sample-oracle-pilot/).</w:t>
             </w:r>
           </w:p>
         </w:tc>
@@ -6442,7 +6475,7 @@
                 <w:rFonts w:ascii="Montserrat" w:hAnsi="Montserrat"/>
                 <w:sz w:val="15"/>
               </w:rPr>
-              <w:t>Open</w:t>
+              <w:t>Open — recommendation applied to builds, awaiting Oracle sample-test result</w:t>
             </w:r>
           </w:p>
         </w:tc>

</xml_diff>